<commit_message>
feat: add team hub, cloud links, and asset download vault
</commit_message>
<xml_diff>
--- a/docs/pautado_draft.docx
+++ b/docs/pautado_draft.docx
@@ -8,7 +8,7 @@
         <w:jc w:val="center"/>
       </w:pPr>
       <w:r>
-        <w:t>REPORTE PAUTADO -- PROYECTO EJEMPLO</w:t>
+        <w:t>REPORTE PAUTADO -- HIDRO-VIGIA</w:t>
       </w:r>
     </w:p>
     <w:p>
@@ -16,19 +16,19 @@
         <w:rPr>
           <w:b/>
         </w:rPr>
-        <w:t>Equipo: EQUIPO EJEMPLO</w:t>
+        <w:t>Equipo: Mentes Pinoleras</w:t>
         <w:br/>
       </w:r>
       <w:r>
-        <w:t>Universidad / Sede: Universidad de Ejemplo</w:t>
+        <w:t>Universidad / Sede: Universidad Nacional de Ingenieria (UNI - RUSB)</w:t>
         <w:br/>
       </w:r>
       <w:r>
-        <w:t>Ciudad Piloto: Managua | Categoria: tecnologica</w:t>
+        <w:t>Ciudad Piloto: Managua (Cuenca Cauce Oriental) | Categoria: tecnologica</w:t>
         <w:br/>
       </w:r>
       <w:r>
-        <w:t>Desafio #00: Desafío de ejemplo</w:t>
+        <w:t>Desafio #02: Redes de sensores comunitarios para prevencion y alerta temprana de inundaciones</w:t>
         <w:br/>
       </w:r>
       <w:r>
@@ -53,7 +53,7 @@
       <w:r>
         <w:t>{SEC_PROBLEMA}</w:t>
         <w:br/>
-        <w:t>Segun registros oficiales, la problematica afecta de manera directa a la poblacion local. La ausencia de soluciones accesibles y descentralizadas agrava la vulnerabilidad territorial, requiriendo intervencion inmediata.</w:t>
+        <w:t>En Nicaragua, las inundaciones y anegaciones afectan anualmente a mas de 120,000 personas en zonas urbanas y periurbanas de la cuenca del Pacifico (SINAPRED (Sistema Nacional para la Prevencion, Mitigacion y Atencion de Desastres), 2024). El 42% de las perdidas materiales en eventos hidroclimaticos extremos se deben a la falta de telemetria en tiempo real en los primeros 30 minutos del evento (CEPAL (Comision Economica para America Latina y el Caribe), 2024). Las redes LoRaWAN permiten una reduccion del 78% en costos de transmision comparado con servicios celulares dedicados en zonas de baja cobertura (IEEE Communications Surveys &amp; Tutorials, 2023). La ausencia de soluciones accesibles y descentralizadas agrava la vulnerabilidad territorial, requiriendo intervencion inmediata.</w:t>
         <w:br/>
         <w:t>{SEC_END}</w:t>
       </w:r>
@@ -70,7 +70,7 @@
       <w:r>
         <w:t>{SEC_SOLUCION}</w:t>
         <w:br/>
-        <w:t>Sistema que resuelve el problema X usando tecnología Y para beneficiar a Z. El diseno optimiza el rendimiento mediante una arquitectura modular y componentes estandarizados.</w:t>
+        <w:t>Sistema ciber-fisico de telemetria hiperlocal con sensores de nivel ultrasonicos y red LoRaWAN para alerta temprana comunitaria con 30 minutos de anticipacion. El diseno optimiza el rendimiento mediante una arquitectura modular y componentes estandarizados.</w:t>
         <w:br/>
         <w:t>{SEC_END}</w:t>
       </w:r>
@@ -121,7 +121,7 @@
       <w:r>
         <w:t>{SEC_IMPACTO}</w:t>
         <w:br/>
-        <w:t>Alineado directamente con ODS11 y la estrategia de resiliencia comunitaria. Se proyecta beneficiar directamente a mas de 2,500 habitantes en la fase piloto.</w:t>
+        <w:t>Alineado directamente con ODS 11, ODS 13, ODS 3 y la estrategia de resiliencia comunitaria. Se proyecta beneficiar directamente a mas de 2,500 habitantes en la fase piloto.</w:t>
         <w:br/>
         <w:t>{SEC_END}</w:t>
       </w:r>

</xml_diff>